<commit_message>
AL-202 update nikoloz's AL-4 use case now that AL-16 is Done
</commit_message>
<xml_diff>
--- a/docs/sprint-1-submission/nikoloz/AL-4-accounts-and-roles.docx
+++ b/docs/sprint-1-submission/nikoloz/AL-4-accounts-and-roles.docx
@@ -776,7 +776,7 @@
               <w:rPr>
                 <w:sz w:val="18"/>
               </w:rPr>
-              <w:t>In progress: pull requests in review</w:t>
+              <w:t>Done. Sign out from Your details moved to its own Sprint 2 story (AL-256)</w:t>
             </w:r>
           </w:p>
         </w:tc>
@@ -1059,7 +1059,7 @@
         <w:pStyle w:val="ListBullet"/>
       </w:pPr>
       <w:r>
-        <w:t>Every story in this epic meets its acceptance criteria and is merged to main. AL-17, AL-18 and AL-142 are Done. AL-16 is still in review, so the epic stays open until it merges.</w:t>
+        <w:t>Every story in this epic meets its acceptance criteria and is merged to main. All four stories (AL-16, AL-17, AL-18 and AL-142) are Done. The one piece left out of AL-16, sign out from the iOS Your details screen, is its own Sprint 2 story (AL-256).</w:t>
       </w:r>
     </w:p>
     <w:p>

</xml_diff>